<commit_message>
Add polished lab reports for labs 2-4
Co-authored-by: Copilot <223556219+Copilot@users.noreply.github.com>
</commit_message>
<xml_diff>
--- a/Лабораторна_№2/Звіт/Лабораторна_№2.docx
+++ b/Лабораторна_№2/Звіт/Лабораторна_№2.docx
@@ -9,9 +9,10 @@
       <w:r>
         <w:rPr>
           <w:b/>
-          <w:sz w:val="32"/>
+          <w:sz w:val="28"/>
         </w:rPr>
-        <w:t>МІНІСТЕРСТВО ОСВІТИ І НАУКИ УКРАЇНИ</w:t>
+        <w:t>Міністерство освіти і науки України</w:t>
+        <w:br/>
       </w:r>
     </w:p>
     <w:p>
@@ -21,9 +22,9 @@
       <w:r>
         <w:rPr>
           <w:b/>
-          <w:sz w:val="32"/>
+          <w:sz w:val="30"/>
         </w:rPr>
-        <w:t>НАЦІОНАЛЬНИЙ УНІВЕРСИТЕТ "ЛЬВІВСЬКА ПОЛІТЕХНІКА"</w:t>
+        <w:t>НАЦІОНАЛЬНИЙ УНІВЕРСИТЕТ «ЛЬВІВСЬКА ПОЛІТЕХНІКА»</w:t>
       </w:r>
     </w:p>
     <w:p>
@@ -35,7 +36,20 @@
           <w:b/>
           <w:sz w:val="28"/>
         </w:rPr>
-        <w:t>Кафедра ЕОМ</w:t>
+        <w:t>Кафедра електроніки та обчислювальної техніки</w:t>
+      </w:r>
+    </w:p>
+    <w:p/>
+    <w:p>
+      <w:pPr>
+        <w:jc w:val="center"/>
+      </w:pPr>
+      <w:r>
+        <w:rPr>
+          <w:b/>
+          <w:sz w:val="36"/>
+        </w:rPr>
+        <w:t>ЗВІТ</w:t>
       </w:r>
     </w:p>
     <w:p>
@@ -45,9 +59,9 @@
       <w:r>
         <w:rPr>
           <w:b/>
-          <w:sz w:val="32"/>
+          <w:sz w:val="36"/>
         </w:rPr>
-        <w:t>МЕТОДИЧНІ ВКАЗІВКИ</w:t>
+        <w:t>з лабораторної роботи №2</w:t>
       </w:r>
     </w:p>
     <w:p>
@@ -59,7 +73,7 @@
           <w:b/>
           <w:sz w:val="28"/>
         </w:rPr>
-        <w:t>до курсу лабораторних робіт</w:t>
+        <w:t>з дисципліни «Інженерія програмного забезпечення»</w:t>
       </w:r>
     </w:p>
     <w:p>
@@ -71,46 +85,50 @@
           <w:b/>
           <w:sz w:val="28"/>
         </w:rPr>
-        <w:t>з дисципліни</w:t>
+        <w:t>Тема: Розробка WPF-клієнта для управління пацієнтами лікарні</w:t>
       </w:r>
     </w:p>
+    <w:p/>
+    <w:p/>
+    <w:p>
+      <w:pPr>
+        <w:jc w:val="left"/>
+      </w:pPr>
+      <w:r>
+        <w:t>Виконав: студент групи КІ-302</w:t>
+      </w:r>
+    </w:p>
+    <w:p>
+      <w:pPr>
+        <w:jc w:val="right"/>
+      </w:pPr>
+      <w:r>
+        <w:t>Куницький М.О.</w:t>
+      </w:r>
+    </w:p>
+    <w:p>
+      <w:pPr>
+        <w:jc w:val="left"/>
+      </w:pPr>
+      <w:r>
+        <w:t>Прийняв:</w:t>
+      </w:r>
+    </w:p>
+    <w:p>
+      <w:pPr>
+        <w:jc w:val="right"/>
+      </w:pPr>
+      <w:r>
+        <w:t>Іванов Ю.С.</w:t>
+      </w:r>
+    </w:p>
+    <w:p/>
     <w:p>
       <w:pPr>
         <w:jc w:val="center"/>
       </w:pPr>
       <w:r>
-        <w:rPr>
-          <w:b/>
-          <w:sz w:val="32"/>
-        </w:rPr>
-        <w:t>"ІНЖЕНЕРІЯ ПРОГРАМНОГО ЗАБЕЗПЕЧЕННЯ"</w:t>
-      </w:r>
-    </w:p>
-    <w:p>
-      <w:r/>
-    </w:p>
-    <w:p>
-      <w:pPr>
-        <w:jc w:val="center"/>
-      </w:pPr>
-      <w:r>
-        <w:rPr>
-          <w:b/>
-          <w:sz w:val="32"/>
-        </w:rPr>
-        <w:t>Лабораторна робота №2</w:t>
-      </w:r>
-    </w:p>
-    <w:p>
-      <w:pPr>
-        <w:jc w:val="center"/>
-      </w:pPr>
-      <w:r>
-        <w:rPr>
-          <w:b/>
-          <w:sz w:val="28"/>
-        </w:rPr>
-        <w:t>Розробка GUI для системи управління пацієнтами лікарні</w:t>
+        <w:t>Львів – 2026</w:t>
       </w:r>
     </w:p>
     <w:p>
@@ -122,73 +140,211 @@
       <w:r>
         <w:rPr>
           <w:b/>
+          <w:sz w:val="32"/>
         </w:rPr>
-        <w:t>Тема</w:t>
+        <w:t>1. Аналіз завдання та постановка задачі</w:t>
       </w:r>
     </w:p>
     <w:p>
       <w:r>
-        <w:t>Система адміністрування пацієнтів у лікарні.</w:t>
+        <w:t>Потрібно створити WPF-додаток із таблицею пацієнтів, кнопками управління та інтерфейсом для редагування даних.</w:t>
+      </w:r>
+    </w:p>
+    <w:p>
+      <w:r>
+        <w:t>Мета роботи: Розробити графічний інтерфейс та логіку керування медичними картками пацієнтів у лікарні, включаючи додавання, редагування та виписку записів.</w:t>
       </w:r>
     </w:p>
     <w:p>
       <w:r>
         <w:rPr>
           <w:b/>
+          <w:sz w:val="32"/>
         </w:rPr>
-        <w:t>Мета</w:t>
+        <w:t>2. Опис реалізованого рішення</w:t>
       </w:r>
     </w:p>
     <w:p>
+      <w:pPr/>
       <w:r>
-        <w:t>Освоїти принципи розробки GUI, серверної логіки та взаємодії між клієнтом і сервером для системи обліку пацієнтів лікарні.</w:t>
+        <w:t>Лабораторна робота присвячена розробці графічного інтерфейсу системи обліку пацієнтів лікарні. У межах завдання необхідно було створити зручну для працівників лікарні форму відображення інформації про пацієнтів, а також забезпечити можливість швидкого оновлення даних.</w:t>
+      </w:r>
+    </w:p>
+    <w:p>
+      <w:pPr/>
+      <w:r>
+        <w:t>Для реалізації було обрано технологію WPF, що дозволяє створити інтуїтивно зрозумілий інтерфейс із таблицею RecordsGrid/DataGrid, панелями керування та діалоговими вікнами. Основна ідея полягає в тому, щоб поділити бізнес-логіку, інтерфейс та дані, використовуючи модель Patient як основу для всієї системи.</w:t>
+      </w:r>
+    </w:p>
+    <w:p>
+      <w:pPr/>
+      <w:r>
+        <w:t>Модель Patient містить поля Id, FullName, Age, Diagnosis, Doctor, Room. Таке представлення повністю охоплює інформацію необхідну для обліку пацієнта в стаціонарі. Усі ці властивості були використані для відображення в таблиці та для форм редагування.</w:t>
+      </w:r>
+    </w:p>
+    <w:p>
+      <w:pPr/>
+      <w:r>
+        <w:t>Для зберігання даних застосовано ObservableCollection&lt;Patient&gt;, що забезпечує автоматичне оновлення DataGrid при додаванні, зміні або видаленні запису. Це є критично важливим для інтерактивної роботи користувача, оскільки зміни в колекції миттєво відображаються в користувацькому інтерфейсі.</w:t>
+      </w:r>
+    </w:p>
+    <w:p>
+      <w:pPr/>
+      <w:r>
+        <w:t>Логіка кнопок додавання, редагування та виписки реалізована через окремі методи обробки подій. Для створення нового запису відкривається просте діалогове вікно, де користувач вводить дані. Для редагування вибирається поточний рядок у таблиці, після чого відкривається форма, де можна змінити значення полів. Для виписки виконується підтвердження дії перед видаленням.</w:t>
+      </w:r>
+    </w:p>
+    <w:p>
+      <w:pPr/>
+      <w:r>
+        <w:t>Після реалізації було перевірено основні сценарії роботи: створення пацієнта, редагування даних, видалення запису, перевірка валідації та оновлення інтерфейсу після кожної зміни. Усі сценарії працювали стабільно і коректно.</w:t>
       </w:r>
     </w:p>
     <w:p>
       <w:r>
         <w:rPr>
           <w:b/>
+          <w:sz w:val="32"/>
         </w:rPr>
-        <w:t>Постановка задачі</w:t>
+        <w:t>3. Основні технології та архітектура</w:t>
       </w:r>
     </w:p>
     <w:p>
+      <w:pPr>
+        <w:pStyle w:val="ListBullet"/>
+      </w:pPr>
       <w:r>
-        <w:t>Розробити систему, що дозволяє вести облік пацієнтів, зберігати інформацію про їх стан, лікаря, діагноз і кімнату, а також забезпечити механізми додавання, редагування, виписки та синхронізації даних між клієнтом і сервером.</w:t>
+        <w:t>Використано платформу WPF для реалізації клієнтського інтерфейсу.</w:t>
+      </w:r>
+    </w:p>
+    <w:p>
+      <w:pPr>
+        <w:pStyle w:val="ListBullet"/>
+      </w:pPr>
+      <w:r>
+        <w:t>Модель даних пацієнта визначена як окремий клас із обов’язковими атрибутами.</w:t>
+      </w:r>
+    </w:p>
+    <w:p>
+      <w:pPr>
+        <w:pStyle w:val="ListBullet"/>
+      </w:pPr>
+      <w:r>
+        <w:t>Для оновлення інтерфейсу застосовано ObservableCollection, що забезпечує реакцію на зміни даних.</w:t>
+      </w:r>
+    </w:p>
+    <w:p>
+      <w:pPr>
+        <w:pStyle w:val="ListBullet"/>
+      </w:pPr>
+      <w:r>
+        <w:t>Для серверної частини використано TCP-обробку запитів і SQLite як систему зберігання даних.</w:t>
+      </w:r>
+    </w:p>
+    <w:p>
+      <w:pPr>
+        <w:pStyle w:val="ListBullet"/>
+      </w:pPr>
+      <w:r>
+        <w:t>Комунікація між клієнтом і сервером реалізована за допомогою JSON-структур.</w:t>
       </w:r>
     </w:p>
     <w:p>
       <w:r>
         <w:rPr>
           <w:b/>
+          <w:sz w:val="32"/>
         </w:rPr>
-        <w:t>Опис роботи</w:t>
+        <w:t>4. Програмна реалізація та перевірка</w:t>
+      </w:r>
+    </w:p>
+    <w:p>
+      <w:pPr>
+        <w:pStyle w:val="ListBullet"/>
+      </w:pPr>
+      <w:r>
+        <w:t>Під час розробки було визначено, що система повинна бути максимально простою для користувача, але в той же час достатньо надійною для ведення медичної інформації.</w:t>
+      </w:r>
+    </w:p>
+    <w:p>
+      <w:pPr>
+        <w:pStyle w:val="ListBullet"/>
+      </w:pPr>
+      <w:r>
+        <w:t>Необхідно передбачити базову валідацію полів, щоб уникнути додавання записів із пустими або некоректними даними.</w:t>
+      </w:r>
+    </w:p>
+    <w:p>
+      <w:pPr>
+        <w:pStyle w:val="ListBullet"/>
+      </w:pPr>
+      <w:r>
+        <w:t>Важливо, щоб інтерфейс відображав актуальну інформацію у реальному часі, тому було вибрано ObservableCollection як основну структуру даних.</w:t>
       </w:r>
     </w:p>
     <w:p>
       <w:r>
-        <w:t>У лабораторній роботі реалізовано WPF-інтерфейс системи обліку пацієнтів лікарні. Відповідно до завдання, створено клас Patient з полями Id, FullName, Age, Diagnosis, Doctor, Room. Дані пацієнтів зберігаються в ObservableCollection і прив’язані до DataGrid. Для взаємодії з користувачем реалізовано кнопки додавання, редагування і виписки пацієнта. Діалогове вікно з формою для введення даних дозволяє вносити нові записи або редагувати існуючі. Усі зміни відображаються без ручного перезавантаження таблиці, що підтверджує коректну роботу прив’язки даних.</w:t>
-        <w:br/>
-        <w:br/>
-        <w:t>В межах лабораторної роботи також проведено перевірку валідації введених даних: поля "ПІБ", "Вік", "Діагноз", "Лікар" і "Кімната" не можуть бути порожніми, а значення віку перевіряється на допустимий діапазон. Для виписки пацієнта реалізовано повідомлення підтвердження. Отже, лабораторна робота №2 виконана в повному обсязі відповідно до вимог і служить основою для подальшого розширення системи.</w:t>
+        <w:t>Після реалізації були виконані перевірки відповідності інтерфейсу, коректності логіки обробки даних і стабільності роботи базових сценаріїв. Усі основні операції виконувались у межах очікуваних результатів.</w:t>
       </w:r>
     </w:p>
     <w:p>
       <w:r>
         <w:rPr>
           <w:b/>
+          <w:sz w:val="32"/>
         </w:rPr>
-        <w:t>Висновок</w:t>
+        <w:t>5. Результати та висновок</w:t>
       </w:r>
     </w:p>
     <w:p>
       <w:r>
-        <w:t>Результатом виконання лабораторної роботи є робоча система обліку пацієнтів, яка відповідає завданню і готова для демонстрації та подальшого розвитку.</w:t>
+        <w:t>Лабораторна робота №2 виконана успішно. Розроблено функціональний WPF-клієнт, який дозволяє вести облік пацієнтів лікарні, управляти їхніми картками та виконувати базові операції CRUD. Реалізована система відповідає поставленому завданню та має потенціал для подальшого розвитку до повноцінної медичної інформаційної системи.</w:t>
+      </w:r>
+    </w:p>
+    <w:p>
+      <w:r>
+        <w:rPr>
+          <w:b/>
+          <w:sz w:val="32"/>
+        </w:rPr>
+        <w:t>6. Список використаних джерел</w:t>
+      </w:r>
+    </w:p>
+    <w:p>
+      <w:pPr>
+        <w:pStyle w:val="ListBullet"/>
+      </w:pPr>
+      <w:r>
+        <w:t>Microsoft Docs. WPF documentation and data binding patterns.</w:t>
+      </w:r>
+    </w:p>
+    <w:p>
+      <w:pPr>
+        <w:pStyle w:val="ListBullet"/>
+      </w:pPr>
+      <w:r>
+        <w:t>SQLite documentation. Local database management and SQL operations.</w:t>
+      </w:r>
+    </w:p>
+    <w:p>
+      <w:pPr>
+        <w:pStyle w:val="ListBullet"/>
+      </w:pPr>
+      <w:r>
+        <w:t>C# language reference and .NET application architecture guidelines.</w:t>
+      </w:r>
+    </w:p>
+    <w:p>
+      <w:pPr>
+        <w:pStyle w:val="ListBullet"/>
+      </w:pPr>
+      <w:r>
+        <w:t>Практичне завдання з дисципліни «Інженерія програмного забезпечення» для варіанта №12.</w:t>
       </w:r>
     </w:p>
     <w:sectPr>
       <w:pgSz w:w="12240" w:h="15840"/>
-      <w:pgMar w:top="1440" w:right="1800" w:bottom="1440" w:left="1800" w:header="720" w:footer="720" w:gutter="0"/>
+      <w:pgMar w:top="1134" w:right="1575" w:bottom="1134" w:left="1575" w:header="720" w:footer="720" w:gutter="0"/>
       <w:cols w:space="720"/>
       <w:docGrid w:linePitch="360"/>
     </w:sectPr>
@@ -559,6 +715,10 @@
     <w:name w:val="Normal"/>
     <w:qFormat/>
     <w:rsid w:val="00FC693F"/>
+    <w:rPr>
+      <w:rFonts w:ascii="Times New Roman" w:hAnsi="Times New Roman"/>
+      <w:sz w:val="28"/>
+    </w:rPr>
   </w:style>
   <w:style w:type="paragraph" w:styleId="Header">
     <w:name w:val="header"/>

</xml_diff>